<commit_message>
updated lab 2, links
</commit_message>
<xml_diff>
--- a/docs/labs/Lab2-zoo/Lab2.docx
+++ b/docs/labs/Lab2-zoo/Lab2.docx
@@ -23,7 +23,7 @@
         <w:pStyle w:val="Date"/>
       </w:pPr>
       <w:r>
-        <w:t xml:space="preserve">2024-09-03</w:t>
+        <w:t xml:space="preserve">2025-09-09</w:t>
       </w:r>
     </w:p>
     <w:sdt>
@@ -114,7 +114,7 @@
         <w:pStyle w:val="FirstParagraph"/>
       </w:pPr>
       <w:r>
-        <w:t xml:space="preserve">Your task this week is to construct an energy budget for an animal of your choice, very similar to modeling the metabolism of your fossil. Each group will choose a different zoo animal (Letʻs try to spread the groups across the large /small, herbivore/predator combinations).</w:t>
+        <w:t xml:space="preserve">Your task this week is to construct an energy budget for an animal of your choice, very similar to modeling the metabolism of your fossil. Each group will choose a different zoo animal.</w:t>
       </w:r>
     </w:p>
     <w:p>
@@ -232,7 +232,7 @@
         <w:t xml:space="preserve"> </w:t>
       </w:r>
       <w:r>
-        <w:t xml:space="preserve">Approximate the dimensions of your animal. Approximate the volume of your animal, by whatever geometric approximation seems reasonable to you. Animals are ~70% water. Estimate mass from the density of water (1g/cm^3).</w:t>
+        <w:t xml:space="preserve">Approximate the dimensions of your animal. Approximate the volume of your animal, by whatever geometric approximation seems reasonable to you. Estimate mass from the density of water (1g/cm^3).</w:t>
       </w:r>
     </w:p>
     <w:p>
@@ -366,6 +366,18 @@
       </w:pPr>
       <w:r>
         <w:t xml:space="preserve">Take photos and videos that capture the essence of your animal or show something interesting.</w:t>
+      </w:r>
+    </w:p>
+    <w:p>
+      <w:pPr>
+        <w:pStyle w:val="Compact"/>
+        <w:numPr>
+          <w:ilvl w:val="0"/>
+          <w:numId w:val="1003"/>
+        </w:numPr>
+      </w:pPr>
+      <w:r>
+        <w:t xml:space="preserve">If your animal has an info plaque, take a photo of it.</w:t>
       </w:r>
     </w:p>
     <w:p>

</xml_diff>

<commit_message>
udated groups for week 2
</commit_message>
<xml_diff>
--- a/docs/labs/Lab2-zoo/Lab2.docx
+++ b/docs/labs/Lab2-zoo/Lab2.docx
@@ -107,6 +107,18 @@
       </w:pPr>
       <w:r>
         <w:t xml:space="preserve">Water</w:t>
+      </w:r>
+    </w:p>
+    <w:p>
+      <w:pPr>
+        <w:pStyle w:val="Compact"/>
+        <w:numPr>
+          <w:ilvl w:val="0"/>
+          <w:numId w:val="1001"/>
+        </w:numPr>
+      </w:pPr>
+      <w:r>
+        <w:t xml:space="preserve">Your Prelab written in your lab notebook (no quiz this lab)</w:t>
       </w:r>
     </w:p>
     <w:p>

</xml_diff>